<commit_message>
docs: add Revision history to Product Guide + reusable docx generator
Set up ongoing maintenance of the Product Reference Guide: added a
"Revision history" section (dated entries) and committed
tools/build-product-guide-docx.js — a small markdown→Word converter so
the .docx can be regenerated in sync with the .md whenever a major
feature ships. Regenerated the .docx (secret-scanned: clean).

Co-Authored-By: Claude Opus 4.8 <noreply@anthropic.com>
</commit_message>
<xml_diff>
--- a/VISADOO_PRODUCT_REFERENCE_GUIDE.docx
+++ b/VISADOO_PRODUCT_REFERENCE_GUIDE.docx
@@ -6323,6 +6323,50 @@
           <w:color w:val="444444"/>
         </w:rPr>
         <w:t xml:space="preserve"> rules: no secrets in code or chat; keep Row-Level Security on; never let a user change their own role; confirm before anything outward-facing or destructive; one feature at a time with before/after checkpoints; self-verify (including on a phone-width screen) before deploying."</w:t>
+      </w:r>
+    </w:p>
+    <w:p>
+      <w:pPr>
+        <w:pBdr>
+          <w:bottom w:val="single" w:color="999999" w:sz="6" w:space="1"/>
+        </w:pBdr>
+        <w:spacing w:before="80" w:after="160"/>
+      </w:pPr>
+    </w:p>
+    <w:p>
+      <w:pPr>
+        <w:pStyle w:val="Heading2"/>
+      </w:pPr>
+      <w:r>
+        <w:t xml:space="preserve">Revision history</w:t>
+      </w:r>
+    </w:p>
+    <w:p>
+      <w:pPr>
+        <w:spacing w:after="120"/>
+      </w:pPr>
+      <w:r>
+        <w:t xml:space="preserve">_This guide is kept current: it is updated whenever a major feature or new module is added._</w:t>
+      </w:r>
+    </w:p>
+    <w:p>
+      <w:pPr>
+        <w:pStyle w:val="ListParagraph"/>
+        <w:numPr>
+          <w:ilvl w:val="0"/>
+          <w:numId w:val="3"/>
+        </w:numPr>
+        <w:spacing w:after="40"/>
+      </w:pPr>
+      <w:r>
+        <w:rPr>
+          <w:b/>
+          <w:bCs/>
+        </w:rPr>
+        <w:t xml:space="preserve">30 Jun 2026</w:t>
+      </w:r>
+      <w:r>
+        <w:t xml:space="preserve"> — Initial Product Reference Guide created. Reflects: finance module (cost lines, margin, GST, customer payments + numbered receipts, refunds, supplier ledgers, finance reports); automated email + WhatsApp notifications (status, application received, payment received, review request); backend console redesign (compact lists → detail pages for Applications, Customers, Suppliers); INR-only pricing; mobile-number field with country picker; mobile WhatsApp-OTP verification built but switched off pending the WhatsApp template.</w:t>
       </w:r>
     </w:p>
     <w:p>

</xml_diff>

<commit_message>
Birthday module (WhatsApp auto-greeting + 10% offer) — built, OFF by default
Daily 9 AM IST job finds customers whose birthday is today, who have a
WhatsApp number and WhatsApp marketing consent, and enqueues a birthday
greeting with a 10% offer (code HAPPYBDAY10, valid 15 days) — sent via the
existing process-due-messages engine (consent re-checked, logged, once per
year per customer). All dormant behind an inactive automation rule until the
Marketing WhatsApp template `birthday_offer` is approved.

Backend only (Supabase migration `birthday_module` + pg_cron `enqueue-birthdays`);
no website change, no deploy. Product guide + revision history updated; .docx
regenerated (secret-scanned clean).

Co-Authored-By: Claude Opus 4.8 <noreply@anthropic.com>
</commit_message>
<xml_diff>
--- a/VISADOO_PRODUCT_REFERENCE_GUIDE.docx
+++ b/VISADOO_PRODUCT_REFERENCE_GUIDE.docx
@@ -1142,6 +1142,37 @@
     </w:p>
     <w:p>
       <w:pPr>
+        <w:pStyle w:val="ListParagraph"/>
+        <w:numPr>
+          <w:ilvl w:val="0"/>
+          <w:numId w:val="3"/>
+        </w:numPr>
+        <w:spacing w:after="40"/>
+      </w:pPr>
+      <w:r>
+        <w:rPr>
+          <w:b/>
+          <w:bCs/>
+        </w:rPr>
+        <w:t xml:space="preserve">Birthday module</w:t>
+      </w:r>
+      <w:r>
+        <w:t xml:space="preserve"> — an automatic WhatsApp birthday greeting with a 10% offer, sent each morning to opted-in customers whose birthday is that day. Fully built but turned off until the Marketing WhatsApp template (</w:t>
+      </w:r>
+      <w:r>
+        <w:rPr>
+          <w:sz w:val="20"/>
+          <w:szCs w:val="20"/>
+          <w:rFonts w:ascii="Consolas" w:cs="Consolas" w:eastAsia="Consolas" w:hAnsi="Consolas"/>
+        </w:rPr>
+        <w:t xml:space="preserve">birthday_offer</w:t>
+      </w:r>
+      <w:r>
+        <w:t xml:space="preserve">) is approved. See Sections 9 and 15.</w:t>
+      </w:r>
+    </w:p>
+    <w:p>
+      <w:pPr>
         <w:pBdr>
           <w:bottom w:val="single" w:color="999999" w:sz="6" w:space="1"/>
         </w:pBdr>
@@ -5980,6 +6011,47 @@
           <w:b/>
           <w:bCs/>
         </w:rPr>
+        <w:t xml:space="preserve">Birthday module template:</w:t>
+      </w:r>
+      <w:r>
+        <w:t xml:space="preserve"> built and dormant. Needs a </w:t>
+      </w:r>
+      <w:r>
+        <w:rPr>
+          <w:b/>
+          <w:bCs/>
+        </w:rPr>
+        <w:t xml:space="preserve">Marketing</w:t>
+      </w:r>
+      <w:r>
+        <w:t xml:space="preserve"> WhatsApp template </w:t>
+      </w:r>
+      <w:r>
+        <w:rPr>
+          <w:sz w:val="20"/>
+          <w:szCs w:val="20"/>
+          <w:rFonts w:ascii="Consolas" w:cs="Consolas" w:eastAsia="Consolas" w:hAnsi="Consolas"/>
+        </w:rPr>
+        <w:t xml:space="preserve">birthday_offer</w:t>
+      </w:r>
+      <w:r>
+        <w:t xml:space="preserve"> approved in Telinfy (suggested wording: _"Happy Birthday, {{1}}! 🎉 From all of us at Visa Doo, here's our gift to you: 10% off your next visa application with code HAPPYBDAY10, valid for 15 days. Here's to your next journey!"_, sample {{1}}=Aarav). Once approved, send the name + language; it's switched on after a test.</w:t>
+      </w:r>
+    </w:p>
+    <w:p>
+      <w:pPr>
+        <w:pStyle w:val="ListParagraph"/>
+        <w:numPr>
+          <w:ilvl w:val="0"/>
+          <w:numId w:val="3"/>
+        </w:numPr>
+        <w:spacing w:after="40"/>
+      </w:pPr>
+      <w:r>
+        <w:rPr>
+          <w:b/>
+          <w:bCs/>
+        </w:rPr>
         <w:t xml:space="preserve">Visa prices:</w:t>
       </w:r>
       <w:r>
@@ -6347,6 +6419,37 @@
       </w:pPr>
       <w:r>
         <w:t xml:space="preserve">_This guide is kept current: it is updated whenever a major feature or new module is added._</w:t>
+      </w:r>
+    </w:p>
+    <w:p>
+      <w:pPr>
+        <w:pStyle w:val="ListParagraph"/>
+        <w:numPr>
+          <w:ilvl w:val="0"/>
+          <w:numId w:val="3"/>
+        </w:numPr>
+        <w:spacing w:after="40"/>
+      </w:pPr>
+      <w:r>
+        <w:rPr>
+          <w:b/>
+          <w:bCs/>
+        </w:rPr>
+        <w:t xml:space="preserve">30 Jun 2026</w:t>
+      </w:r>
+      <w:r>
+        <w:t xml:space="preserve"> — Birthday module built (WhatsApp auto-greeting + 10% offer for opted-in customers, daily 9 AM IST; runs on the existing engine). Switched OFF pending the </w:t>
+      </w:r>
+      <w:r>
+        <w:rPr>
+          <w:sz w:val="20"/>
+          <w:szCs w:val="20"/>
+          <w:rFonts w:ascii="Consolas" w:cs="Consolas" w:eastAsia="Consolas" w:hAnsi="Consolas"/>
+        </w:rPr>
+        <w:t xml:space="preserve">birthday_offer</w:t>
+      </w:r>
+      <w:r>
+        <w:t xml:space="preserve"> Marketing template approval.</w:t>
       </w:r>
     </w:p>
     <w:p>

</xml_diff>

<commit_message>
Birthday module LIVE — switched on after Meta-approved template + test
birthday_offer template approved; live test to owner succeeded (Telinfy 200,
confirmed received). Activated automation rule wa-birthday — daily 9 AM IST
WhatsApp birthday greeting + 10% offer to opted-in customers. Product guide
+ revision history updated; .docx regenerated (secret-scanned clean).

Co-Authored-By: Claude Opus 4.8 <noreply@anthropic.com>
</commit_message>
<xml_diff>
--- a/VISADOO_PRODUCT_REFERENCE_GUIDE.docx
+++ b/VISADOO_PRODUCT_REFERENCE_GUIDE.docx
@@ -1142,37 +1142,6 @@
     </w:p>
     <w:p>
       <w:pPr>
-        <w:pStyle w:val="ListParagraph"/>
-        <w:numPr>
-          <w:ilvl w:val="0"/>
-          <w:numId w:val="3"/>
-        </w:numPr>
-        <w:spacing w:after="40"/>
-      </w:pPr>
-      <w:r>
-        <w:rPr>
-          <w:b/>
-          <w:bCs/>
-        </w:rPr>
-        <w:t xml:space="preserve">Birthday module</w:t>
-      </w:r>
-      <w:r>
-        <w:t xml:space="preserve"> — an automatic WhatsApp birthday greeting with a 10% offer, sent each morning to opted-in customers whose birthday is that day. Fully built but turned off until the Marketing WhatsApp template (</w:t>
-      </w:r>
-      <w:r>
-        <w:rPr>
-          <w:sz w:val="20"/>
-          <w:szCs w:val="20"/>
-          <w:rFonts w:ascii="Consolas" w:cs="Consolas" w:eastAsia="Consolas" w:hAnsi="Consolas"/>
-        </w:rPr>
-        <w:t xml:space="preserve">birthday_offer</w:t>
-      </w:r>
-      <w:r>
-        <w:t xml:space="preserve">) is approved. See Sections 9 and 15.</w:t>
-      </w:r>
-    </w:p>
-    <w:p>
-      <w:pPr>
         <w:pBdr>
           <w:bottom w:val="single" w:color="999999" w:sz="6" w:space="1"/>
         </w:pBdr>
@@ -4431,6 +4400,83 @@
           </w:p>
         </w:tc>
       </w:tr>
+      <w:tr>
+        <w:tc>
+          <w:tcPr>
+            <w:tcW w:type="dxa" w:w="3120"/>
+            <w:tcBorders>
+              <w:top w:val="single" w:color="CCCCCC" w:sz="1"/>
+              <w:left w:val="single" w:color="CCCCCC" w:sz="1"/>
+              <w:bottom w:val="single" w:color="CCCCCC" w:sz="1"/>
+              <w:right w:val="single" w:color="CCCCCC" w:sz="1"/>
+            </w:tcBorders>
+            <w:tcMar>
+              <w:top w:type="dxa" w:w="60"/>
+              <w:left w:type="dxa" w:w="110"/>
+              <w:bottom w:type="dxa" w:w="60"/>
+              <w:right w:type="dxa" w:w="110"/>
+            </w:tcMar>
+          </w:tcPr>
+          <w:p>
+            <w:pPr>
+              <w:spacing w:after="0"/>
+            </w:pPr>
+            <w:r>
+              <w:t xml:space="preserve">Customer's birthday (daily, 9 AM IST)</w:t>
+            </w:r>
+          </w:p>
+        </w:tc>
+        <w:tc>
+          <w:tcPr>
+            <w:tcW w:type="dxa" w:w="3120"/>
+            <w:tcBorders>
+              <w:top w:val="single" w:color="CCCCCC" w:sz="1"/>
+              <w:left w:val="single" w:color="CCCCCC" w:sz="1"/>
+              <w:bottom w:val="single" w:color="CCCCCC" w:sz="1"/>
+              <w:right w:val="single" w:color="CCCCCC" w:sz="1"/>
+            </w:tcBorders>
+            <w:tcMar>
+              <w:top w:type="dxa" w:w="60"/>
+              <w:left w:type="dxa" w:w="110"/>
+              <w:bottom w:type="dxa" w:w="60"/>
+              <w:right w:type="dxa" w:w="110"/>
+            </w:tcMar>
+          </w:tcPr>
+          <w:p>
+            <w:pPr>
+              <w:spacing w:after="0"/>
+            </w:pPr>
+            <w:r>
+              <w:t xml:space="preserve">—</w:t>
+            </w:r>
+          </w:p>
+        </w:tc>
+        <w:tc>
+          <w:tcPr>
+            <w:tcW w:type="dxa" w:w="3120"/>
+            <w:tcBorders>
+              <w:top w:val="single" w:color="CCCCCC" w:sz="1"/>
+              <w:left w:val="single" w:color="CCCCCC" w:sz="1"/>
+              <w:bottom w:val="single" w:color="CCCCCC" w:sz="1"/>
+              <w:right w:val="single" w:color="CCCCCC" w:sz="1"/>
+            </w:tcBorders>
+            <w:tcMar>
+              <w:top w:type="dxa" w:w="60"/>
+              <w:left w:type="dxa" w:w="110"/>
+              <w:bottom w:type="dxa" w:w="60"/>
+              <w:right w:type="dxa" w:w="110"/>
+            </w:tcMar>
+          </w:tcPr>
+          <w:p>
+            <w:pPr>
+              <w:spacing w:after="0"/>
+            </w:pPr>
+            <w:r>
+              <w:t xml:space="preserve">✅ birthday greeting + 10% offer (only marketing opt-ins)</w:t>
+            </w:r>
+          </w:p>
+        </w:tc>
+      </w:tr>
     </w:tbl>
     <w:p>
       <w:pPr>
@@ -5995,47 +6041,6 @@
       </w:r>
       <w:r>
         <w:t xml:space="preserve"> once approved, the owner sends the template name + language; we plug it in, switch verification on, test, and go live.</w:t>
-      </w:r>
-    </w:p>
-    <w:p>
-      <w:pPr>
-        <w:pStyle w:val="ListParagraph"/>
-        <w:numPr>
-          <w:ilvl w:val="0"/>
-          <w:numId w:val="3"/>
-        </w:numPr>
-        <w:spacing w:after="40"/>
-      </w:pPr>
-      <w:r>
-        <w:rPr>
-          <w:b/>
-          <w:bCs/>
-        </w:rPr>
-        <w:t xml:space="preserve">Birthday module template:</w:t>
-      </w:r>
-      <w:r>
-        <w:t xml:space="preserve"> built and dormant. Needs a </w:t>
-      </w:r>
-      <w:r>
-        <w:rPr>
-          <w:b/>
-          <w:bCs/>
-        </w:rPr>
-        <w:t xml:space="preserve">Marketing</w:t>
-      </w:r>
-      <w:r>
-        <w:t xml:space="preserve"> WhatsApp template </w:t>
-      </w:r>
-      <w:r>
-        <w:rPr>
-          <w:sz w:val="20"/>
-          <w:szCs w:val="20"/>
-          <w:rFonts w:ascii="Consolas" w:cs="Consolas" w:eastAsia="Consolas" w:hAnsi="Consolas"/>
-        </w:rPr>
-        <w:t xml:space="preserve">birthday_offer</w:t>
-      </w:r>
-      <w:r>
-        <w:t xml:space="preserve"> approved in Telinfy (suggested wording: _"Happy Birthday, {{1}}! 🎉 From all of us at Visa Doo, here's our gift to you: 10% off your next visa application with code HAPPYBDAY10, valid for 15 days. Here's to your next journey!"_, sample {{1}}=Aarav). Once approved, send the name + language; it's switched on after a test.</w:t>
       </w:r>
     </w:p>
     <w:p>
@@ -6438,7 +6443,17 @@
         <w:t xml:space="preserve">30 Jun 2026</w:t>
       </w:r>
       <w:r>
-        <w:t xml:space="preserve"> — Birthday module built (WhatsApp auto-greeting + 10% offer for opted-in customers, daily 9 AM IST; runs on the existing engine). Switched OFF pending the </w:t>
+        <w:t xml:space="preserve"> — Birthday module </w:t>
+      </w:r>
+      <w:r>
+        <w:rPr>
+          <w:b/>
+          <w:bCs/>
+        </w:rPr>
+        <w:t xml:space="preserve">LIVE</w:t>
+      </w:r>
+      <w:r>
+        <w:t xml:space="preserve">: WhatsApp auto-greeting + 10% offer (code HAPPYBDAY10, 15 days) to opted-in customers, daily 9 AM IST. Template </w:t>
       </w:r>
       <w:r>
         <w:rPr>
@@ -6449,7 +6464,7 @@
         <w:t xml:space="preserve">birthday_offer</w:t>
       </w:r>
       <w:r>
-        <w:t xml:space="preserve"> Marketing template approval.</w:t>
+        <w:t xml:space="preserve"> approved by Meta; tested and switched on.</w:t>
       </w:r>
     </w:p>
     <w:p>

</xml_diff>

<commit_message>
Messaging: split Communications into Automations · Templates · Message history
Per the "Messaging, built to grow" plan, the single Communications screen is
split into three sidebar screens under the Messaging group so the ever-growing
message log no longer clutters the templates/automation settings:
- Automations (review toggle + Google review link)
- Message templates (list + editor)
- Message history (filters + CSV)

Routing/nav updated (ADMIN_VIEWS, adminNavModel, router guards, resolveStartView,
sidebar icons). Frontend only. Product guide + revision history updated; .docx
regenerated.

Co-Authored-By: Claude Opus 4.8 <noreply@anthropic.com>
</commit_message>
<xml_diff>
--- a/VISADOO_PRODUCT_REFERENCE_GUIDE.docx
+++ b/VISADOO_PRODUCT_REFERENCE_GUIDE.docx
@@ -1257,25 +1257,68 @@
         </w:rPr>
         <w:t xml:space="preserve">Messaging group</w:t>
       </w:r>
-    </w:p>
-    <w:p>
-      <w:pPr>
-        <w:pStyle w:val="ListParagraph"/>
-        <w:numPr>
-          <w:ilvl w:val="0"/>
-          <w:numId w:val="3"/>
-        </w:numPr>
-        <w:spacing w:after="40"/>
-      </w:pPr>
-      <w:r>
-        <w:rPr>
-          <w:b/>
-          <w:bCs/>
-        </w:rPr>
-        <w:t xml:space="preserve">Communications</w:t>
-      </w:r>
-      <w:r>
-        <w:t xml:space="preserve"> — turn automations on/off, set the Google review link, edit message templates, and view the full history of every message sent.</w:t>
+      <w:r>
+        <w:t xml:space="preserve"> (three separate screens, so each can grow without clutter)</w:t>
+      </w:r>
+    </w:p>
+    <w:p>
+      <w:pPr>
+        <w:pStyle w:val="ListParagraph"/>
+        <w:numPr>
+          <w:ilvl w:val="0"/>
+          <w:numId w:val="3"/>
+        </w:numPr>
+        <w:spacing w:after="40"/>
+      </w:pPr>
+      <w:r>
+        <w:rPr>
+          <w:b/>
+          <w:bCs/>
+        </w:rPr>
+        <w:t xml:space="preserve">Automations</w:t>
+      </w:r>
+      <w:r>
+        <w:t xml:space="preserve"> — turn the review-request automation on/off and set the Google review link. (Other automatic messages — status, application/payment confirmations, birthday — run automatically.)</w:t>
+      </w:r>
+    </w:p>
+    <w:p>
+      <w:pPr>
+        <w:pStyle w:val="ListParagraph"/>
+        <w:numPr>
+          <w:ilvl w:val="0"/>
+          <w:numId w:val="3"/>
+        </w:numPr>
+        <w:spacing w:after="40"/>
+      </w:pPr>
+      <w:r>
+        <w:rPr>
+          <w:b/>
+          <w:bCs/>
+        </w:rPr>
+        <w:t xml:space="preserve">Message templates</w:t>
+      </w:r>
+      <w:r>
+        <w:t xml:space="preserve"> — view and edit the wording of every automatic email/WhatsApp.</w:t>
+      </w:r>
+    </w:p>
+    <w:p>
+      <w:pPr>
+        <w:pStyle w:val="ListParagraph"/>
+        <w:numPr>
+          <w:ilvl w:val="0"/>
+          <w:numId w:val="3"/>
+        </w:numPr>
+        <w:spacing w:after="40"/>
+      </w:pPr>
+      <w:r>
+        <w:rPr>
+          <w:b/>
+          <w:bCs/>
+        </w:rPr>
+        <w:t xml:space="preserve">Message history</w:t>
+      </w:r>
+      <w:r>
+        <w:t xml:space="preserve"> — the full log of everything sent, with filters (channel, status, type, date, recipient search) and CSV export.</w:t>
       </w:r>
     </w:p>
     <w:p>
@@ -6424,6 +6467,26 @@
       </w:pPr>
       <w:r>
         <w:t xml:space="preserve">_This guide is kept current: it is updated whenever a major feature or new module is added._</w:t>
+      </w:r>
+    </w:p>
+    <w:p>
+      <w:pPr>
+        <w:pStyle w:val="ListParagraph"/>
+        <w:numPr>
+          <w:ilvl w:val="0"/>
+          <w:numId w:val="3"/>
+        </w:numPr>
+        <w:spacing w:after="40"/>
+      </w:pPr>
+      <w:r>
+        <w:rPr>
+          <w:b/>
+          <w:bCs/>
+        </w:rPr>
+        <w:t xml:space="preserve">30 Jun 2026</w:t>
+      </w:r>
+      <w:r>
+        <w:t xml:space="preserve"> — Messaging split into three screens (Automations · Message templates · Message history) under the Messaging group; message history gained filters (channel/status/type/date/search) + CSV export.</w:t>
       </w:r>
     </w:p>
     <w:p>

</xml_diff>

<commit_message>
Events module (Step 2): dedicated event pages + menu link + sitemap
- New SSR edge function event.js (route /event/<slug>): event hero (image,
  date, city, country flag), recommended "get visa N days before" lead time,
  and a "Get [Country] visa" section listing that country's visa cards.
- Events-page cards now link to /event/<slug>; admin event form has a
  "View live page" link.
- "Events" added to the website menu (index.html) and SSR page headers
  (events/event/country/page). Event URLs added to sitemap.xml.
- Product guide + revision history updated; .docx regenerated.

Events module complete (Step 1 + Step 2).

Co-Authored-By: Claude Opus 4.8 <noreply@anthropic.com>
</commit_message>
<xml_diff>
--- a/VISADOO_PRODUCT_REFERENCE_GUIDE.docx
+++ b/VISADOO_PRODUCT_REFERENCE_GUIDE.docx
@@ -1428,7 +1428,7 @@
         <w:t xml:space="preserve">Destinations</w:t>
       </w:r>
       <w:r>
-        <w:t xml:space="preserve"> (countries/groups) and </w:t>
+        <w:t xml:space="preserve"> (countries/groups), </w:t>
       </w:r>
       <w:r>
         <w:rPr>
@@ -1438,7 +1438,17 @@
         <w:t xml:space="preserve">Visa Types</w:t>
       </w:r>
       <w:r>
-        <w:t xml:space="preserve"> (add/edit visas, prices, processing time, per-visa questions, SEO).</w:t>
+        <w:t xml:space="preserve"> (add/edit visas, prices, processing time, per-visa questions, SEO), and </w:t>
+      </w:r>
+      <w:r>
+        <w:rPr>
+          <w:b/>
+          <w:bCs/>
+        </w:rPr>
+        <w:t xml:space="preserve">Events</w:t>
+      </w:r>
+      <w:r>
+        <w:t xml:space="preserve"> (add/edit international events that promote a country's visas — name, country, category, dates, image, on/off).</w:t>
       </w:r>
     </w:p>
     <w:p>
@@ -1600,6 +1610,37 @@
       </w:r>
       <w:r>
         <w:t xml:space="preserve"> (visadoo-uae.netlify.app): homepage with destination search, reviews, FAQs, and the brand message; individual country and visa pages built to be Google-friendly.</w:t>
+      </w:r>
+    </w:p>
+    <w:p>
+      <w:pPr>
+        <w:pStyle w:val="ListParagraph"/>
+        <w:numPr>
+          <w:ilvl w:val="0"/>
+          <w:numId w:val="3"/>
+        </w:numPr>
+        <w:spacing w:after="40"/>
+      </w:pPr>
+      <w:r>
+        <w:rPr>
+          <w:b/>
+          <w:bCs/>
+        </w:rPr>
+        <w:t xml:space="preserve">Events</w:t>
+      </w:r>
+      <w:r>
+        <w:t xml:space="preserve"> (</w:t>
+      </w:r>
+      <w:r>
+        <w:rPr>
+          <w:sz w:val="20"/>
+          <w:szCs w:val="20"/>
+          <w:rFonts w:ascii="Consolas" w:cs="Consolas" w:eastAsia="Consolas" w:hAnsi="Consolas"/>
+        </w:rPr>
+        <w:t xml:space="preserve">/events</w:t>
+      </w:r>
+      <w:r>
+        <w:t xml:space="preserve">, linked in the menu): an Atlys-style page of international events grouped by month with category tabs; each event has its own page that promotes that country's visas ("Get [Country] visa", with a recommended lead-time before the event).</w:t>
       </w:r>
     </w:p>
     <w:p>
@@ -6467,6 +6508,37 @@
       </w:pPr>
       <w:r>
         <w:t xml:space="preserve">_This guide is kept current: it is updated whenever a major feature or new module is added._</w:t>
+      </w:r>
+    </w:p>
+    <w:p>
+      <w:pPr>
+        <w:pStyle w:val="ListParagraph"/>
+        <w:numPr>
+          <w:ilvl w:val="0"/>
+          <w:numId w:val="3"/>
+        </w:numPr>
+        <w:spacing w:after="40"/>
+      </w:pPr>
+      <w:r>
+        <w:rPr>
+          <w:b/>
+          <w:bCs/>
+        </w:rPr>
+        <w:t xml:space="preserve">30 Jun 2026</w:t>
+      </w:r>
+      <w:r>
+        <w:t xml:space="preserve"> — Events module LIVE: public </w:t>
+      </w:r>
+      <w:r>
+        <w:rPr>
+          <w:sz w:val="20"/>
+          <w:szCs w:val="20"/>
+          <w:rFonts w:ascii="Consolas" w:cs="Consolas" w:eastAsia="Consolas" w:hAnsi="Consolas"/>
+        </w:rPr>
+        <w:t xml:space="preserve">/events</w:t>
+      </w:r>
+      <w:r>
+        <w:t xml:space="preserve"> page (month timeline + category tabs) + dedicated per-event pages promoting each country's visas + "Events" menu link; backend Events manager under Catalogue. (events table; edge functions events.js + event.js.)</w:t>
       </w:r>
     </w:p>
     <w:p>

</xml_diff>

<commit_message>
docs: regenerate Product Guide .docx (customer edit + resend entries)
Refresh the Word file to match the .md (was locked/open in Word during the
previous commit).

Co-Authored-By: Claude Opus 4.8 <noreply@anthropic.com>
</commit_message>
<xml_diff>
--- a/VISADOO_PRODUCT_REFERENCE_GUIDE.docx
+++ b/VISADOO_PRODUCT_REFERENCE_GUIDE.docx
@@ -1238,7 +1238,27 @@
         <w:t xml:space="preserve">Customers</w:t>
       </w:r>
       <w:r>
-        <w:t xml:space="preserve"> — one clean record per person (auto-gathered from applications and enquiries), with marketing on/off and CSV export.</w:t>
+        <w:t xml:space="preserve"> — one clean record per person (auto-gathered from applications and enquiries), with marketing on/off and CSV export. Admins can </w:t>
+      </w:r>
+      <w:r>
+        <w:rPr>
+          <w:b/>
+          <w:bCs/>
+        </w:rPr>
+        <w:t xml:space="preserve">Edit</w:t>
+      </w:r>
+      <w:r>
+        <w:t xml:space="preserve"> any field (name, mobile with country picker, email, date of birth, country, state, notes, status), and an </w:t>
+      </w:r>
+      <w:r>
+        <w:rPr>
+          <w:b/>
+          <w:bCs/>
+        </w:rPr>
+        <w:t xml:space="preserve">Edit history</w:t>
+      </w:r>
+      <w:r>
+        <w:t xml:space="preserve"> tab logs every change (old → new, who, when).</w:t>
       </w:r>
     </w:p>
     <w:p>
@@ -6508,6 +6528,36 @@
       </w:pPr>
       <w:r>
         <w:t xml:space="preserve">_This guide is kept current: it is updated whenever a major feature or new module is added._</w:t>
+      </w:r>
+    </w:p>
+    <w:p>
+      <w:pPr>
+        <w:pStyle w:val="ListParagraph"/>
+        <w:numPr>
+          <w:ilvl w:val="0"/>
+          <w:numId w:val="3"/>
+        </w:numPr>
+        <w:spacing w:after="40"/>
+      </w:pPr>
+      <w:r>
+        <w:rPr>
+          <w:b/>
+          <w:bCs/>
+        </w:rPr>
+        <w:t xml:space="preserve">01 Jul 2026</w:t>
+      </w:r>
+      <w:r>
+        <w:t xml:space="preserve"> — Customer records are now editable by admins (all fields, mobile with country picker) with a field-by-field </w:t>
+      </w:r>
+      <w:r>
+        <w:rPr>
+          <w:b/>
+          <w:bCs/>
+        </w:rPr>
+        <w:t xml:space="preserve">Edit history</w:t>
+      </w:r>
+      <w:r>
+        <w:t xml:space="preserve"> (who/what/when). Also: WhatsApp sender now prefers the application's number, and failed messages have a Resend-with-guidance option.</w:t>
       </w:r>
     </w:p>
     <w:p>

</xml_diff>

<commit_message>
Applications: admin edit form (all applicant fields) + Edit history
Application detail page now has Details / Edit history tabs (admins only).
Admins can Edit every applicant field (name, mobile via country picker,
email, passport number, DOB, passport expiry, nationality, country, state,
visa type, notes); each save logs field-by-field changes (old → new, who,
when) to a new admin-only application_edits table. Status is intentionally
left to its existing control (which notifies the customer). Mirrors the
customer-edit feature. Product guide + revision history + .docx updated.

Co-Authored-By: Claude Opus 4.8 <noreply@anthropic.com>
</commit_message>
<xml_diff>
--- a/VISADOO_PRODUCT_REFERENCE_GUIDE.docx
+++ b/VISADOO_PRODUCT_REFERENCE_GUIDE.docx
@@ -1198,7 +1198,27 @@
         <w:t xml:space="preserve">Applications</w:t>
       </w:r>
       <w:r>
-        <w:t xml:space="preserve"> — the heart of operations. A clean, searchable list; click any application to open its full page (documents, answers, conversation, finance, and the controls to change status, request documents, and attach the issued visa). Filters by status, payment, supplier, new reply, pending refund, and more.</w:t>
+        <w:t xml:space="preserve"> — the heart of operations. A clean, searchable list; click any application to open its full page (documents, answers, conversation, finance, and the controls to change status, request documents, and attach the issued visa). Filters by status, payment, supplier, new reply, pending refund, and more. </w:t>
+      </w:r>
+      <w:r>
+        <w:rPr>
+          <w:b/>
+          <w:bCs/>
+        </w:rPr>
+        <w:t xml:space="preserve">Admins can Edit</w:t>
+      </w:r>
+      <w:r>
+        <w:t xml:space="preserve"> the applicant's details (name, mobile with country picker, email, passport, dates, country, visa type, notes) with a field-by-field </w:t>
+      </w:r>
+      <w:r>
+        <w:rPr>
+          <w:b/>
+          <w:bCs/>
+        </w:rPr>
+        <w:t xml:space="preserve">Edit history</w:t>
+      </w:r>
+      <w:r>
+        <w:t xml:space="preserve"> (status is changed via its own control, which notifies the customer).</w:t>
       </w:r>
     </w:p>
     <w:p>
@@ -6528,6 +6548,26 @@
       </w:pPr>
       <w:r>
         <w:t xml:space="preserve">_This guide is kept current: it is updated whenever a major feature or new module is added._</w:t>
+      </w:r>
+    </w:p>
+    <w:p>
+      <w:pPr>
+        <w:pStyle w:val="ListParagraph"/>
+        <w:numPr>
+          <w:ilvl w:val="0"/>
+          <w:numId w:val="3"/>
+        </w:numPr>
+        <w:spacing w:after="40"/>
+      </w:pPr>
+      <w:r>
+        <w:rPr>
+          <w:b/>
+          <w:bCs/>
+        </w:rPr>
+        <w:t xml:space="preserve">01 Jul 2026</w:t>
+      </w:r>
+      <w:r>
+        <w:t xml:space="preserve"> — Applications are now editable by admins (all applicant fields, mobile with country picker) with a field-by-field Edit history; status stays in its notifying control.</w:t>
       </w:r>
     </w:p>
     <w:p>

</xml_diff>

<commit_message>
Audit Centre (Phase 1): platform-wide change log (admin/owner only)
New central `audit_logs` table (admin-only read + insert, append-only — no
update/delete policy; never stores secrets). New admin-only "Audit Centre"
screen (own Audit sidebar group) that MERGES the existing logs — application_edits,
customer_edits, finance_audit_log, and Messaging events — with the central
table into one searchable/filterable timeline (date range, staff, module,
action, reference search, sensitive/high-risk toggle) + click-to-expand
plain-English detail + risk pills. Staff role changes now write to audit_logs.

Existing edit histories + finance audit untouched (no schema/RLS changes).
Product guide + revision history + .docx updated. Migration: audit_logs_central.

Co-Authored-By: Claude Opus 4.8 <noreply@anthropic.com>
</commit_message>
<xml_diff>
--- a/VISADOO_PRODUCT_REFERENCE_GUIDE.docx
+++ b/VISADOO_PRODUCT_REFERENCE_GUIDE.docx
@@ -1593,6 +1593,36 @@
     </w:p>
     <w:p>
       <w:pPr>
+        <w:pStyle w:val="ListParagraph"/>
+        <w:numPr>
+          <w:ilvl w:val="0"/>
+          <w:numId w:val="3"/>
+        </w:numPr>
+        <w:spacing w:after="40"/>
+      </w:pPr>
+      <w:r>
+        <w:rPr>
+          <w:b/>
+          <w:bCs/>
+        </w:rPr>
+        <w:t xml:space="preserve">Audit group</w:t>
+      </w:r>
+      <w:r>
+        <w:t xml:space="preserve"> — </w:t>
+      </w:r>
+      <w:r>
+        <w:rPr>
+          <w:b/>
+          <w:bCs/>
+        </w:rPr>
+        <w:t xml:space="preserve">Audit Centre</w:t>
+      </w:r>
+      <w:r>
+        <w:t xml:space="preserve"> (Admin/Owner only): one searchable, filterable timeline of important changes across the whole platform (who · when · module · record · action · old → new · risk level), merging the existing edit histories (Applications, Customers), the Finance audit, and Messaging events with a new central audit log. Read-only and append-only; staff role changes are now recorded here.</w:t>
+      </w:r>
+    </w:p>
+    <w:p>
+      <w:pPr>
         <w:spacing w:after="120"/>
       </w:pPr>
       <w:r>
@@ -6548,6 +6578,37 @@
       </w:pPr>
       <w:r>
         <w:t xml:space="preserve">_This guide is kept current: it is updated whenever a major feature or new module is added._</w:t>
+      </w:r>
+    </w:p>
+    <w:p>
+      <w:pPr>
+        <w:pStyle w:val="ListParagraph"/>
+        <w:numPr>
+          <w:ilvl w:val="0"/>
+          <w:numId w:val="3"/>
+        </w:numPr>
+        <w:spacing w:after="40"/>
+      </w:pPr>
+      <w:r>
+        <w:rPr>
+          <w:b/>
+          <w:bCs/>
+        </w:rPr>
+        <w:t xml:space="preserve">01 Jul 2026</w:t>
+      </w:r>
+      <w:r>
+        <w:t xml:space="preserve"> — Audit Centre (Phase 1) added: admin/owner-only backend screen unifying existing edit histories + Finance audit + Messaging into one filterable log, plus a new append-only central </w:t>
+      </w:r>
+      <w:r>
+        <w:rPr>
+          <w:sz w:val="20"/>
+          <w:szCs w:val="20"/>
+          <w:rFonts w:ascii="Consolas" w:cs="Consolas" w:eastAsia="Consolas" w:hAnsi="Consolas"/>
+        </w:rPr>
+        <w:t xml:space="preserve">audit_logs</w:t>
+      </w:r>
+      <w:r>
+        <w:t xml:space="preserve"> table; staff role changes now recorded. (Future modules will log to the central table.)</w:t>
       </w:r>
     </w:p>
     <w:p>

</xml_diff>

<commit_message>
Audit Centre (Phase 2): wire more modules into the central log
Add logAudit() calls at write points not previously audited (finance/suppliers
already log via finance_audit_log):
- Application status changes (old→new + note, high-risk for Visa Issued)
- Catalogue & pricing: visa types (save/delete, price/ETA), destinations,
  groups, events (save/delete)
- Content & settings: articles, pages, FAQs, reviews (save/delete); Brand,
  Email (no key value), Site SEO saves
- Exports: every CSV download (via downloadCsv) with row count
- Customer marketing-consent changes (via setCustMarketing)

Frontend-only; no DB/RLS changes. Guide revision history updated + .docx.

Co-Authored-By: Claude Opus 4.8 <noreply@anthropic.com>
</commit_message>
<xml_diff>
--- a/VISADOO_PRODUCT_REFERENCE_GUIDE.docx
+++ b/VISADOO_PRODUCT_REFERENCE_GUIDE.docx
@@ -6578,6 +6578,26 @@
       </w:pPr>
       <w:r>
         <w:t xml:space="preserve">_This guide is kept current: it is updated whenever a major feature or new module is added._</w:t>
+      </w:r>
+    </w:p>
+    <w:p>
+      <w:pPr>
+        <w:pStyle w:val="ListParagraph"/>
+        <w:numPr>
+          <w:ilvl w:val="0"/>
+          <w:numId w:val="3"/>
+        </w:numPr>
+        <w:spacing w:after="40"/>
+      </w:pPr>
+      <w:r>
+        <w:rPr>
+          <w:b/>
+          <w:bCs/>
+        </w:rPr>
+        <w:t xml:space="preserve">01 Jul 2026</w:t>
+      </w:r>
+      <w:r>
+        <w:t xml:space="preserve"> — Audit Centre (Phase 2 wiring): more actions now recorded to the central log — application status changes, catalogue &amp; pricing (visa types, destinations, groups, events), content &amp; settings (articles, pages, FAQs, reviews, brand, email, site SEO), CSV exports, and marketing-consent changes.</w:t>
       </w:r>
     </w:p>
     <w:p>

</xml_diff>

<commit_message>
Finance reports: Supplier-wise detailed report + cost-line invoice no.
- New "Supplier-wise detailed report" section in Finance reports (Finance/Admin
  only): one row per supplier cost line with the sample columns (Sl.No,
  Application Date, PAX Name, Passport, Visa Type, Country, Supplier, Invoice No,
  Supplier Cost ₹, Currency=INR, Status, Remarks, Visadoo App No.) + CSV export.
- Added an "Application status" filter to Finance reports (date/supplier/visa
  filters already respected by the new report).
- Added a nullable invoice_no column to application_cost_lines + an "invoice no."
  input on each supplier cost line in the finance panel (saved with the line).
- Currency shows INR (finance stays INR); additive DB column; Finance/Admin-only;
  no change to money maths. Guide + revision history + .docx updated.

Co-Authored-By: Claude Opus 4.8 <noreply@anthropic.com>
</commit_message>
<xml_diff>
--- a/VISADOO_PRODUCT_REFERENCE_GUIDE.docx
+++ b/VISADOO_PRODUCT_REFERENCE_GUIDE.docx
@@ -1438,7 +1438,27 @@
         <w:t xml:space="preserve">Finance reports</w:t>
       </w:r>
       <w:r>
-        <w:t xml:space="preserve"> — receivables, supplier payables, and profit margins, each exportable to CSV.</w:t>
+        <w:t xml:space="preserve"> — receivables, supplier payables, profit margins, and a </w:t>
+      </w:r>
+      <w:r>
+        <w:rPr>
+          <w:b/>
+          <w:bCs/>
+        </w:rPr>
+        <w:t xml:space="preserve">Supplier-wise detailed report</w:t>
+      </w:r>
+      <w:r>
+        <w:t xml:space="preserve"> (row per supplier cost line: date, applicant, passport, visa, country, supplier, invoice no., cost, status, reference), each exportable to CSV. Filters include date range, supplier, visa, application status, and customer payment. (Each supplier cost line now also has an </w:t>
+      </w:r>
+      <w:r>
+        <w:rPr>
+          <w:b/>
+          <w:bCs/>
+        </w:rPr>
+        <w:t xml:space="preserve">invoice no.</w:t>
+      </w:r>
+      <w:r>
+        <w:t xml:space="preserve"> field in the per-application finance panel.)</w:t>
       </w:r>
     </w:p>
     <w:p>
@@ -6578,6 +6598,56 @@
       </w:pPr>
       <w:r>
         <w:t xml:space="preserve">_This guide is kept current: it is updated whenever a major feature or new module is added._</w:t>
+      </w:r>
+    </w:p>
+    <w:p>
+      <w:pPr>
+        <w:pStyle w:val="ListParagraph"/>
+        <w:numPr>
+          <w:ilvl w:val="0"/>
+          <w:numId w:val="3"/>
+        </w:numPr>
+        <w:spacing w:after="40"/>
+      </w:pPr>
+      <w:r>
+        <w:rPr>
+          <w:b/>
+          <w:bCs/>
+        </w:rPr>
+        <w:t xml:space="preserve">01 Jul 2026</w:t>
+      </w:r>
+      <w:r>
+        <w:t xml:space="preserve"> — Finance reports: added a </w:t>
+      </w:r>
+      <w:r>
+        <w:rPr>
+          <w:b/>
+          <w:bCs/>
+        </w:rPr>
+        <w:t xml:space="preserve">Supplier-wise detailed report</w:t>
+      </w:r>
+      <w:r>
+        <w:t xml:space="preserve"> (row per supplier cost line, sample-style columns, CSV export) + an </w:t>
+      </w:r>
+      <w:r>
+        <w:rPr>
+          <w:b/>
+          <w:bCs/>
+        </w:rPr>
+        <w:t xml:space="preserve">Application status</w:t>
+      </w:r>
+      <w:r>
+        <w:t xml:space="preserve"> filter; each cost line now has a </w:t>
+      </w:r>
+      <w:r>
+        <w:rPr>
+          <w:b/>
+          <w:bCs/>
+        </w:rPr>
+        <w:t xml:space="preserve">supplier invoice no.</w:t>
+      </w:r>
+      <w:r>
+        <w:t xml:space="preserve"> field.</w:t>
       </w:r>
     </w:p>
     <w:p>

</xml_diff>

<commit_message>
CRM Phase 1: Leads pipeline + Follow-ups + Enquiry→Lead→Application
- New CRM sidebar group: Enquiries (moved in, now with Convert to lead), Leads, Follow-ups
- New tables leads + lead_activities (activity trail append-only); RLS: admin/agent/sales full, viewer read-only, customers never see leads
- Enquiries & customers table access widened to CRM roles so Sales can match/create the linked person
- Lead detail: stage (New→Contacted→Qualified→Quoted→Converted/Lost), owner (defaults to creator), next follow-up, expected ₹ value, notes, activity log; Add lead (walk-in/phone); Convert to application (admin/agent, pre-filled)
- Follow-ups screen: due-today/overdue
- All CRM actions logged to the Audit Centre
- Product Reference Guide (.md + .docx) + revision history updated

Co-Authored-By: Claude Opus 4.8 <noreply@anthropic.com>
</commit_message>
<xml_diff>
--- a/VISADOO_PRODUCT_REFERENCE_GUIDE.docx
+++ b/VISADOO_PRODUCT_REFERENCE_GUIDE.docx
@@ -1235,50 +1235,200 @@
           <w:b/>
           <w:bCs/>
         </w:rPr>
+        <w:t xml:space="preserve">Customers</w:t>
+      </w:r>
+      <w:r>
+        <w:t xml:space="preserve"> — one clean record per person (auto-gathered from applications and enquiries), with marketing on/off and CSV export. Admins can </w:t>
+      </w:r>
+      <w:r>
+        <w:rPr>
+          <w:b/>
+          <w:bCs/>
+        </w:rPr>
+        <w:t xml:space="preserve">Edit</w:t>
+      </w:r>
+      <w:r>
+        <w:t xml:space="preserve"> any field (name, mobile with country picker, email, date of birth, country, state, notes, status), and an </w:t>
+      </w:r>
+      <w:r>
+        <w:rPr>
+          <w:b/>
+          <w:bCs/>
+        </w:rPr>
+        <w:t xml:space="preserve">Edit history</w:t>
+      </w:r>
+      <w:r>
+        <w:t xml:space="preserve"> tab logs every change (old → new, who, when).</w:t>
+      </w:r>
+    </w:p>
+    <w:p>
+      <w:pPr>
+        <w:pStyle w:val="ListParagraph"/>
+        <w:numPr>
+          <w:ilvl w:val="0"/>
+          <w:numId w:val="3"/>
+        </w:numPr>
+        <w:spacing w:after="40"/>
+      </w:pPr>
+      <w:r>
+        <w:rPr>
+          <w:b/>
+          <w:bCs/>
+        </w:rPr>
+        <w:t xml:space="preserve">CRM group</w:t>
+      </w:r>
+      <w:r>
+        <w:t xml:space="preserve"> (Admin/Agent/Sales full; Viewer read-only) — the internal sales pipeline for turning interest into applications.</w:t>
+      </w:r>
+    </w:p>
+    <w:p>
+      <w:pPr>
+        <w:pStyle w:val="ListParagraph"/>
+        <w:numPr>
+          <w:ilvl w:val="0"/>
+          <w:numId w:val="3"/>
+        </w:numPr>
+        <w:spacing w:after="40"/>
+      </w:pPr>
+      <w:r>
+        <w:rPr>
+          <w:b/>
+          <w:bCs/>
+        </w:rPr>
         <w:t xml:space="preserve">Enquiries</w:t>
       </w:r>
       <w:r>
-        <w:t xml:space="preserve"> — every contact-form enquiry, logged with a reference (ENQ-000001 series).</w:t>
-      </w:r>
-    </w:p>
-    <w:p>
-      <w:pPr>
-        <w:pStyle w:val="ListParagraph"/>
-        <w:numPr>
-          <w:ilvl w:val="0"/>
-          <w:numId w:val="3"/>
-        </w:numPr>
-        <w:spacing w:after="40"/>
-      </w:pPr>
-      <w:r>
-        <w:rPr>
-          <w:b/>
-          <w:bCs/>
-        </w:rPr>
-        <w:t xml:space="preserve">Customers</w:t>
-      </w:r>
-      <w:r>
-        <w:t xml:space="preserve"> — one clean record per person (auto-gathered from applications and enquiries), with marketing on/off and CSV export. Admins can </w:t>
-      </w:r>
-      <w:r>
-        <w:rPr>
-          <w:b/>
-          <w:bCs/>
-        </w:rPr>
-        <w:t xml:space="preserve">Edit</w:t>
-      </w:r>
-      <w:r>
-        <w:t xml:space="preserve"> any field (name, mobile with country picker, email, date of birth, country, state, notes, status), and an </w:t>
-      </w:r>
-      <w:r>
-        <w:rPr>
-          <w:b/>
-          <w:bCs/>
-        </w:rPr>
-        <w:t xml:space="preserve">Edit history</w:t>
-      </w:r>
-      <w:r>
-        <w:t xml:space="preserve"> tab logs every change (old → new, who, when).</w:t>
+        <w:t xml:space="preserve"> — every contact-form enquiry, logged with a reference (ENQ-000001 series). Staff can mark status (New/Contacted/Closed) and press </w:t>
+      </w:r>
+      <w:r>
+        <w:rPr>
+          <w:b/>
+          <w:bCs/>
+        </w:rPr>
+        <w:t xml:space="preserve">Convert to lead</w:t>
+      </w:r>
+      <w:r>
+        <w:t xml:space="preserve"> to start a pipeline record (the person is matched or created automatically).</w:t>
+      </w:r>
+    </w:p>
+    <w:p>
+      <w:pPr>
+        <w:pStyle w:val="ListParagraph"/>
+        <w:numPr>
+          <w:ilvl w:val="0"/>
+          <w:numId w:val="3"/>
+        </w:numPr>
+        <w:spacing w:after="40"/>
+      </w:pPr>
+      <w:r>
+        <w:rPr>
+          <w:b/>
+          <w:bCs/>
+        </w:rPr>
+        <w:t xml:space="preserve">Leads</w:t>
+      </w:r>
+      <w:r>
+        <w:t xml:space="preserve"> — potential customers you are following up. Each lead has a number (LEAD-000001), a </w:t>
+      </w:r>
+      <w:r>
+        <w:rPr>
+          <w:b/>
+          <w:bCs/>
+        </w:rPr>
+        <w:t xml:space="preserve">stage</w:t>
+      </w:r>
+      <w:r>
+        <w:t xml:space="preserve"> (New → Contacted → Qualified → Quoted → Converted / Lost), an </w:t>
+      </w:r>
+      <w:r>
+        <w:rPr>
+          <w:b/>
+          <w:bCs/>
+        </w:rPr>
+        <w:t xml:space="preserve">owner</w:t>
+      </w:r>
+      <w:r>
+        <w:t xml:space="preserve"> (defaults to whoever created it), a </w:t>
+      </w:r>
+      <w:r>
+        <w:rPr>
+          <w:b/>
+          <w:bCs/>
+        </w:rPr>
+        <w:t xml:space="preserve">next follow-up date</w:t>
+      </w:r>
+      <w:r>
+        <w:t xml:space="preserve">, an optional </w:t>
+      </w:r>
+      <w:r>
+        <w:rPr>
+          <w:b/>
+          <w:bCs/>
+        </w:rPr>
+        <w:t xml:space="preserve">expected value (₹)</w:t>
+      </w:r>
+      <w:r>
+        <w:t xml:space="preserve">, notes, and an </w:t>
+      </w:r>
+      <w:r>
+        <w:rPr>
+          <w:b/>
+          <w:bCs/>
+        </w:rPr>
+        <w:t xml:space="preserve">activity trail</w:t>
+      </w:r>
+      <w:r>
+        <w:t xml:space="preserve"> (log notes/calls; every stage/owner change is recorded). Compact searchable list with filters (stage, owner, source, due/overdue) and CSV export, plus an open-pipeline value total. </w:t>
+      </w:r>
+      <w:r>
+        <w:rPr>
+          <w:b/>
+          <w:bCs/>
+        </w:rPr>
+        <w:t xml:space="preserve">Add lead</w:t>
+      </w:r>
+      <w:r>
+        <w:t xml:space="preserve"> captures walk-in/phone/referral leads. </w:t>
+      </w:r>
+      <w:r>
+        <w:rPr>
+          <w:b/>
+          <w:bCs/>
+        </w:rPr>
+        <w:t xml:space="preserve">Convert to application</w:t>
+      </w:r>
+      <w:r>
+        <w:t xml:space="preserve"> (Admin/Agent) turns a qualified lead into a real application — pre-filled from the lead, collecting passport/nationality — and links the two so no data is re-typed.</w:t>
+      </w:r>
+    </w:p>
+    <w:p>
+      <w:pPr>
+        <w:pStyle w:val="ListParagraph"/>
+        <w:numPr>
+          <w:ilvl w:val="0"/>
+          <w:numId w:val="3"/>
+        </w:numPr>
+        <w:spacing w:after="40"/>
+      </w:pPr>
+      <w:r>
+        <w:rPr>
+          <w:b/>
+          <w:bCs/>
+        </w:rPr>
+        <w:t xml:space="preserve">Follow-ups</w:t>
+      </w:r>
+      <w:r>
+        <w:t xml:space="preserve"> — a focused list of leads </w:t>
+      </w:r>
+      <w:r>
+        <w:rPr>
+          <w:b/>
+          <w:bCs/>
+        </w:rPr>
+        <w:t xml:space="preserve">due today or overdue</w:t>
+      </w:r>
+      <w:r>
+        <w:t xml:space="preserve">, filterable by owner, so nothing slips.</w:t>
       </w:r>
     </w:p>
     <w:p>
@@ -2690,7 +2840,7 @@
           <w:b/>
           <w:bCs/>
         </w:rPr>
-        <w:t xml:space="preserve">There are 29 data tables, and every single one has Row-Level Security turned ON</w:t>
+        <w:t xml:space="preserve">There are 31 data tables, and every single one has Row-Level Security turned ON</w:t>
       </w:r>
       <w:r>
         <w:t xml:space="preserve"> (meaning each request is checked against the rules above). In plain English, the main groups are:</w:t>
@@ -2821,7 +2971,49 @@
         <w:t xml:space="preserve">enquiries</w:t>
       </w:r>
       <w:r>
-        <w:t xml:space="preserve"> (contact-form leads).</w:t>
+        <w:t xml:space="preserve"> (contact-form enquiries).</w:t>
+      </w:r>
+    </w:p>
+    <w:p>
+      <w:pPr>
+        <w:pStyle w:val="ListParagraph"/>
+        <w:numPr>
+          <w:ilvl w:val="0"/>
+          <w:numId w:val="3"/>
+        </w:numPr>
+        <w:spacing w:after="40"/>
+      </w:pPr>
+      <w:r>
+        <w:rPr>
+          <w:b/>
+          <w:bCs/>
+        </w:rPr>
+        <w:t xml:space="preserve">CRM:</w:t>
+      </w:r>
+      <w:r>
+        <w:t xml:space="preserve"> </w:t>
+      </w:r>
+      <w:r>
+        <w:rPr>
+          <w:sz w:val="20"/>
+          <w:szCs w:val="20"/>
+          <w:rFonts w:ascii="Consolas" w:cs="Consolas" w:eastAsia="Consolas" w:hAnsi="Consolas"/>
+        </w:rPr>
+        <w:t xml:space="preserve">leads</w:t>
+      </w:r>
+      <w:r>
+        <w:t xml:space="preserve"> (sales pipeline records — stage, owner, follow-up date, value, links to the customer/enquiry/application), </w:t>
+      </w:r>
+      <w:r>
+        <w:rPr>
+          <w:sz w:val="20"/>
+          <w:szCs w:val="20"/>
+          <w:rFonts w:ascii="Consolas" w:cs="Consolas" w:eastAsia="Consolas" w:hAnsi="Consolas"/>
+        </w:rPr>
+        <w:t xml:space="preserve">lead_activities</w:t>
+      </w:r>
+      <w:r>
+        <w:t xml:space="preserve"> (append-only notes/calls and stage/owner history for each lead).</w:t>
       </w:r>
     </w:p>
     <w:p>
@@ -6598,6 +6790,108 @@
       </w:pPr>
       <w:r>
         <w:t xml:space="preserve">_This guide is kept current: it is updated whenever a major feature or new module is added._</w:t>
+      </w:r>
+    </w:p>
+    <w:p>
+      <w:pPr>
+        <w:pStyle w:val="ListParagraph"/>
+        <w:numPr>
+          <w:ilvl w:val="0"/>
+          <w:numId w:val="3"/>
+        </w:numPr>
+        <w:spacing w:after="40"/>
+      </w:pPr>
+      <w:r>
+        <w:rPr>
+          <w:b/>
+          <w:bCs/>
+        </w:rPr>
+        <w:t xml:space="preserve">02 Jul 2026</w:t>
+      </w:r>
+      <w:r>
+        <w:t xml:space="preserve"> — </w:t>
+      </w:r>
+      <w:r>
+        <w:rPr>
+          <w:b/>
+          <w:bCs/>
+        </w:rPr>
+        <w:t xml:space="preserve">CRM (Phase 1) LIVE</w:t>
+      </w:r>
+      <w:r>
+        <w:t xml:space="preserve">: new </w:t>
+      </w:r>
+      <w:r>
+        <w:rPr>
+          <w:b/>
+          <w:bCs/>
+        </w:rPr>
+        <w:t xml:space="preserve">CRM</w:t>
+      </w:r>
+      <w:r>
+        <w:t xml:space="preserve"> sidebar group containing </w:t>
+      </w:r>
+      <w:r>
+        <w:rPr>
+          <w:b/>
+          <w:bCs/>
+        </w:rPr>
+        <w:t xml:space="preserve">Enquiries</w:t>
+      </w:r>
+      <w:r>
+        <w:t xml:space="preserve"> (moved here, now with </w:t>
+      </w:r>
+      <w:r>
+        <w:rPr>
+          <w:b/>
+          <w:bCs/>
+        </w:rPr>
+        <w:t xml:space="preserve">Convert to lead</w:t>
+      </w:r>
+      <w:r>
+        <w:t xml:space="preserve">), </w:t>
+      </w:r>
+      <w:r>
+        <w:rPr>
+          <w:b/>
+          <w:bCs/>
+        </w:rPr>
+        <w:t xml:space="preserve">Leads</w:t>
+      </w:r>
+      <w:r>
+        <w:t xml:space="preserve"> (pipeline — stage New→Contacted→Qualified→Quoted→Converted/Lost, owner, next follow-up, expected ₹ value, activity trail, Add lead, Convert to application), and </w:t>
+      </w:r>
+      <w:r>
+        <w:rPr>
+          <w:b/>
+          <w:bCs/>
+        </w:rPr>
+        <w:t xml:space="preserve">Follow-ups</w:t>
+      </w:r>
+      <w:r>
+        <w:t xml:space="preserve"> (due-today/overdue list). Access: Admin/Agent/Sales full, Viewer read-only. New append-only tables </w:t>
+      </w:r>
+      <w:r>
+        <w:rPr>
+          <w:sz w:val="20"/>
+          <w:szCs w:val="20"/>
+          <w:rFonts w:ascii="Consolas" w:cs="Consolas" w:eastAsia="Consolas" w:hAnsi="Consolas"/>
+        </w:rPr>
+        <w:t xml:space="preserve">leads</w:t>
+      </w:r>
+      <w:r>
+        <w:t xml:space="preserve"> + </w:t>
+      </w:r>
+      <w:r>
+        <w:rPr>
+          <w:sz w:val="20"/>
+          <w:szCs w:val="20"/>
+          <w:rFonts w:ascii="Consolas" w:cs="Consolas" w:eastAsia="Consolas" w:hAnsi="Consolas"/>
+        </w:rPr>
+        <w:t xml:space="preserve">lead_activities</w:t>
+      </w:r>
+      <w:r>
+        <w:t xml:space="preserve">; Enquiries &amp; Customers table access widened to the CRM roles so Sales can match/create the linked person. CRM actions are recorded in the Audit Centre.</w:t>
       </w:r>
     </w:p>
     <w:p>

</xml_diff>

<commit_message>
Global 'Chat with us' WhatsApp button on all customer-facing pages
- branding.js: auto-inject the exact homepage .wa-float button on any page that
  loads branding.js and has no button yet (no duplicates on homepage/visa page).
  Reuses existing styles.css styling + site_settings link/label. Future frontend
  pages inherit it automatically.
- app.css: hide the float on the staff console (.has-admin-side .wa-float) so the
  admin backend stays uncluttered; customer apply/track/sign-in keep it.
- Product guide: standing frontend rule + revision history.
No DB / RLS / messaging / edge-function changes.

Co-Authored-By: Claude Opus 4.8 <noreply@anthropic.com>
</commit_message>
<xml_diff>
--- a/VISADOO_PRODUCT_REFERENCE_GUIDE.docx
+++ b/VISADOO_PRODUCT_REFERENCE_GUIDE.docx
@@ -5889,6 +5889,124 @@
           <w:b/>
           <w:bCs/>
         </w:rPr>
+        <w:t xml:space="preserve">STANDING FRONTEND RULE — global "Chat with us" WhatsApp button:</w:t>
+      </w:r>
+      <w:r>
+        <w:t xml:space="preserve"> </w:t>
+      </w:r>
+      <w:r>
+        <w:rPr>
+          <w:sz w:val="20"/>
+          <w:szCs w:val="20"/>
+          <w:rFonts w:ascii="Consolas" w:cs="Consolas" w:eastAsia="Consolas" w:hAnsi="Consolas"/>
+        </w:rPr>
+        <w:t xml:space="preserve">branding.js</w:t>
+      </w:r>
+      <w:r>
+        <w:t xml:space="preserve"> auto-injects the floating WhatsApp button (</w:t>
+      </w:r>
+      <w:r>
+        <w:rPr>
+          <w:sz w:val="20"/>
+          <w:szCs w:val="20"/>
+          <w:rFonts w:ascii="Consolas" w:cs="Consolas" w:eastAsia="Consolas" w:hAnsi="Consolas"/>
+        </w:rPr>
+        <w:t xml:space="preserve">.wa-float</w:t>
+      </w:r>
+      <w:r>
+        <w:t xml:space="preserve">, fixed bottom-right, styled by </w:t>
+      </w:r>
+      <w:r>
+        <w:rPr>
+          <w:sz w:val="20"/>
+          <w:szCs w:val="20"/>
+          <w:rFonts w:ascii="Consolas" w:cs="Consolas" w:eastAsia="Consolas" w:hAnsi="Consolas"/>
+        </w:rPr>
+        <w:t xml:space="preserve">styles.css</w:t>
+      </w:r>
+      <w:r>
+        <w:t xml:space="preserve">) on any customer-facing page that loads </w:t>
+      </w:r>
+      <w:r>
+        <w:rPr>
+          <w:sz w:val="20"/>
+          <w:szCs w:val="20"/>
+          <w:rFonts w:ascii="Consolas" w:cs="Consolas" w:eastAsia="Consolas" w:hAnsi="Consolas"/>
+        </w:rPr>
+        <w:t xml:space="preserve">branding.js</w:t>
+      </w:r>
+      <w:r>
+        <w:t xml:space="preserve"> and doesn't already hard-code one. </w:t>
+      </w:r>
+      <w:r>
+        <w:rPr>
+          <w:b/>
+          <w:bCs/>
+        </w:rPr>
+        <w:t xml:space="preserve">All future customer-facing frontend pages must include the same global button in the same fixed position/layout via this shared component</w:t>
+      </w:r>
+      <w:r>
+        <w:t xml:space="preserve"> — in practice, just make sure the page loads </w:t>
+      </w:r>
+      <w:r>
+        <w:rPr>
+          <w:sz w:val="20"/>
+          <w:szCs w:val="20"/>
+          <w:rFonts w:ascii="Consolas" w:cs="Consolas" w:eastAsia="Consolas" w:hAnsi="Consolas"/>
+        </w:rPr>
+        <w:t xml:space="preserve">branding.js</w:t>
+      </w:r>
+      <w:r>
+        <w:t xml:space="preserve"> (every public page and edge function already does) and it appears automatically, with the correct WhatsApp link/label from </w:t>
+      </w:r>
+      <w:r>
+        <w:rPr>
+          <w:sz w:val="20"/>
+          <w:szCs w:val="20"/>
+          <w:rFonts w:ascii="Consolas" w:cs="Consolas" w:eastAsia="Consolas" w:hAnsi="Consolas"/>
+        </w:rPr>
+        <w:t xml:space="preserve">site_settings</w:t>
+      </w:r>
+      <w:r>
+        <w:t xml:space="preserve">. It is hidden on the admin console via </w:t>
+      </w:r>
+      <w:r>
+        <w:rPr>
+          <w:sz w:val="20"/>
+          <w:szCs w:val="20"/>
+          <w:rFonts w:ascii="Consolas" w:cs="Consolas" w:eastAsia="Consolas" w:hAnsi="Consolas"/>
+        </w:rPr>
+        <w:t xml:space="preserve">.has-admin-side .wa-float{display:none}</w:t>
+      </w:r>
+      <w:r>
+        <w:t xml:space="preserve"> in </w:t>
+      </w:r>
+      <w:r>
+        <w:rPr>
+          <w:sz w:val="20"/>
+          <w:szCs w:val="20"/>
+          <w:rFonts w:ascii="Consolas" w:cs="Consolas" w:eastAsia="Consolas" w:hAnsi="Consolas"/>
+        </w:rPr>
+        <w:t xml:space="preserve">app.css</w:t>
+      </w:r>
+      <w:r>
+        <w:t xml:space="preserve">. Do not hand-code a second one.</w:t>
+      </w:r>
+    </w:p>
+    <w:p>
+      <w:pPr>
+        <w:pStyle w:val="ListParagraph"/>
+        <w:numPr>
+          <w:ilvl w:val="0"/>
+          <w:numId w:val="3"/>
+        </w:numPr>
+        <w:spacing w:after="40"/>
+      </w:pPr>
+      <w:r>
+        <w:rPr>
+          <w:b/>
+          <w:bCs/>
+        </w:rPr>
         <w:t xml:space="preserve">Database:</w:t>
       </w:r>
       <w:r>
@@ -6790,6 +6908,58 @@
       </w:pPr>
       <w:r>
         <w:t xml:space="preserve">_This guide is kept current: it is updated whenever a major feature or new module is added._</w:t>
+      </w:r>
+    </w:p>
+    <w:p>
+      <w:pPr>
+        <w:pStyle w:val="ListParagraph"/>
+        <w:numPr>
+          <w:ilvl w:val="0"/>
+          <w:numId w:val="3"/>
+        </w:numPr>
+        <w:spacing w:after="40"/>
+      </w:pPr>
+      <w:r>
+        <w:rPr>
+          <w:b/>
+          <w:bCs/>
+        </w:rPr>
+        <w:t xml:space="preserve">02 Jul 2026</w:t>
+      </w:r>
+      <w:r>
+        <w:t xml:space="preserve"> — </w:t>
+      </w:r>
+      <w:r>
+        <w:rPr>
+          <w:b/>
+          <w:bCs/>
+        </w:rPr>
+        <w:t xml:space="preserve">Global "Chat with us" WhatsApp button</w:t>
+      </w:r>
+      <w:r>
+        <w:t xml:space="preserve">: </w:t>
+      </w:r>
+      <w:r>
+        <w:rPr>
+          <w:sz w:val="20"/>
+          <w:szCs w:val="20"/>
+          <w:rFonts w:ascii="Consolas" w:cs="Consolas" w:eastAsia="Consolas" w:hAnsi="Consolas"/>
+        </w:rPr>
+        <w:t xml:space="preserve">branding.js</w:t>
+      </w:r>
+      <w:r>
+        <w:t xml:space="preserve"> now auto-injects the exact homepage floating button on every customer-facing page (country, visa, article, content page, events, event detail, apply/track) that doesn't already have one — no duplicates, same fixed position/wording/icon/link. Future frontend pages inherit it automatically. Hidden on the admin console (one </w:t>
+      </w:r>
+      <w:r>
+        <w:rPr>
+          <w:sz w:val="20"/>
+          <w:szCs w:val="20"/>
+          <w:rFonts w:ascii="Consolas" w:cs="Consolas" w:eastAsia="Consolas" w:hAnsi="Consolas"/>
+        </w:rPr>
+        <w:t xml:space="preserve">app.css</w:t>
+      </w:r>
+      <w:r>
+        <w:t xml:space="preserve"> rule). No DB/RLS/messaging changes.</w:t>
       </w:r>
     </w:p>
     <w:p>

</xml_diff>

<commit_message>
Fix: WhatsApp float now shows on server-rendered pages (number fallback)
Edge/SSR pages (country/visa/article/events) don't load config.js, and
site_settings.contact_whatsapp is empty, so branding.js had no number and hid
the injected button. Add WA_FALLBACK in branding.js (mirrors config.js); the
Brand & Settings WhatsApp number still overrides. No DB/RLS/messaging changes.

Co-Authored-By: Claude Opus 4.8 <noreply@anthropic.com>
</commit_message>
<xml_diff>
--- a/VISADOO_PRODUCT_REFERENCE_GUIDE.docx
+++ b/VISADOO_PRODUCT_REFERENCE_GUIDE.docx
@@ -6959,7 +6959,29 @@
         <w:t xml:space="preserve">app.css</w:t>
       </w:r>
       <w:r>
-        <w:t xml:space="preserve"> rule). No DB/RLS/messaging changes.</w:t>
+        <w:t xml:space="preserve"> rule). No DB/RLS/messaging changes. _(Fix same day: added a WhatsApp-number fallback in </w:t>
+      </w:r>
+      <w:r>
+        <w:rPr>
+          <w:sz w:val="20"/>
+          <w:szCs w:val="20"/>
+          <w:rFonts w:ascii="Consolas" w:cs="Consolas" w:eastAsia="Consolas" w:hAnsi="Consolas"/>
+        </w:rPr>
+        <w:t xml:space="preserve">branding.js</w:t>
+      </w:r>
+      <w:r>
+        <w:t xml:space="preserve"> so the button also shows on the server-rendered pages, which don't load </w:t>
+      </w:r>
+      <w:r>
+        <w:rPr>
+          <w:sz w:val="20"/>
+          <w:szCs w:val="20"/>
+          <w:rFonts w:ascii="Consolas" w:cs="Consolas" w:eastAsia="Consolas" w:hAnsi="Consolas"/>
+        </w:rPr>
+        <w:t xml:space="preserve">config.js</w:t>
+      </w:r>
+      <w:r>
+        <w:t xml:space="preserve">; Brand &amp; Settings' WhatsApp number still overrides it.)_</w:t>
       </w:r>
     </w:p>
     <w:p>

</xml_diff>

<commit_message>
Docs: mobile WhatsApp OTP live & mandatory (otp_verification wired, tested)
Co-Authored-By: Claude Opus 4.8 <noreply@anthropic.com>
</commit_message>
<xml_diff>
--- a/VISADOO_PRODUCT_REFERENCE_GUIDE.docx
+++ b/VISADOO_PRODUCT_REFERENCE_GUIDE.docx
@@ -6908,6 +6908,47 @@
       </w:pPr>
       <w:r>
         <w:t xml:space="preserve">_This guide is kept current: it is updated whenever a major feature or new module is added._</w:t>
+      </w:r>
+    </w:p>
+    <w:p>
+      <w:pPr>
+        <w:pStyle w:val="ListParagraph"/>
+        <w:numPr>
+          <w:ilvl w:val="0"/>
+          <w:numId w:val="3"/>
+        </w:numPr>
+        <w:spacing w:after="40"/>
+      </w:pPr>
+      <w:r>
+        <w:rPr>
+          <w:b/>
+          <w:bCs/>
+        </w:rPr>
+        <w:t xml:space="preserve">02 Jul 2026</w:t>
+      </w:r>
+      <w:r>
+        <w:t xml:space="preserve"> — </w:t>
+      </w:r>
+      <w:r>
+        <w:rPr>
+          <w:b/>
+          <w:bCs/>
+        </w:rPr>
+        <w:t xml:space="preserve">Mobile-number verification (WhatsApp OTP) — LIVE &amp; mandatory</w:t>
+      </w:r>
+      <w:r>
+        <w:t xml:space="preserve">: public applicants must verify their mobile number with a one-time WhatsApp code (approved </w:t>
+      </w:r>
+      <w:r>
+        <w:rPr>
+          <w:sz w:val="20"/>
+          <w:szCs w:val="20"/>
+          <w:rFonts w:ascii="Consolas" w:cs="Consolas" w:eastAsia="Consolas" w:hAnsi="Consolas"/>
+        </w:rPr>
+        <w:t xml:space="preserve">otp_verification</w:t>
+      </w:r>
+      <w:r>
+        <w:t xml:space="preserve"> template) before they can submit. Field is "Mobile number" with a country picker (default +91); code valid 10 min, resend after 30s, 5 tries. If the code can't be received, submission is blocked but a "Contact us on WhatsApp" help line is shown (and staff can apply on their behalf, which skips OTP). Staff see a "Mobile ✓" badge on verified applications. Tested end-to-end to the owner's WhatsApp before switch-on.</w:t>
       </w:r>
     </w:p>
     <w:p>

</xml_diff>

<commit_message>
Docs: Admin Dashboard (Phase 1) in Product Guide + revision history
Co-Authored-By: Claude Opus 4.8 <noreply@anthropic.com>
</commit_message>
<xml_diff>
--- a/VISADOO_PRODUCT_REFERENCE_GUIDE.docx
+++ b/VISADOO_PRODUCT_REFERENCE_GUIDE.docx
@@ -6908,6 +6908,36 @@
       </w:pPr>
       <w:r>
         <w:t xml:space="preserve">_This guide is kept current: it is updated whenever a major feature or new module is added._</w:t>
+      </w:r>
+    </w:p>
+    <w:p>
+      <w:pPr>
+        <w:pStyle w:val="ListParagraph"/>
+        <w:numPr>
+          <w:ilvl w:val="0"/>
+          <w:numId w:val="3"/>
+        </w:numPr>
+        <w:spacing w:after="40"/>
+      </w:pPr>
+      <w:r>
+        <w:rPr>
+          <w:b/>
+          <w:bCs/>
+        </w:rPr>
+        <w:t xml:space="preserve">02 Jul 2026</w:t>
+      </w:r>
+      <w:r>
+        <w:t xml:space="preserve"> — </w:t>
+      </w:r>
+      <w:r>
+        <w:rPr>
+          <w:b/>
+          <w:bCs/>
+        </w:rPr>
+        <w:t xml:space="preserve">Admin Dashboard (Phase 1)</w:t>
+      </w:r>
+      <w:r>
+        <w:t xml:space="preserve">: new "Dashboard" menu item (top of the admin area; the default screen staff land on). Read-only. Tabs: Overview, Leads, Operations, Staff performance, and Revenue (Admin/Finance only). Filters: period (default This month), staff (Admin/Finance only), country, lead source. Role safety: money/revenue shown only to Admin &amp; Finance; sales/operations/viewer staff see their own performance only and no money; customers can't open it. Shows real data (leads, enquiries, applications, payments, refunds, staff activity). No supplier cost/profit/margin, no passport/document details, nothing editable.</w:t>
       </w:r>
     </w:p>
     <w:p>

</xml_diff>

<commit_message>
Docs: SEO improvements (image alt + editable addresses) in Product Guide
Co-Authored-By: Claude Opus 4.8 <noreply@anthropic.com>
</commit_message>
<xml_diff>
--- a/VISADOO_PRODUCT_REFERENCE_GUIDE.docx
+++ b/VISADOO_PRODUCT_REFERENCE_GUIDE.docx
@@ -6908,6 +6908,76 @@
       </w:pPr>
       <w:r>
         <w:t xml:space="preserve">_This guide is kept current: it is updated whenever a major feature or new module is added._</w:t>
+      </w:r>
+    </w:p>
+    <w:p>
+      <w:pPr>
+        <w:pStyle w:val="ListParagraph"/>
+        <w:numPr>
+          <w:ilvl w:val="0"/>
+          <w:numId w:val="3"/>
+        </w:numPr>
+        <w:spacing w:after="40"/>
+      </w:pPr>
+      <w:r>
+        <w:rPr>
+          <w:b/>
+          <w:bCs/>
+        </w:rPr>
+        <w:t xml:space="preserve">03 Jul 2026</w:t>
+      </w:r>
+      <w:r>
+        <w:t xml:space="preserve"> — </w:t>
+      </w:r>
+      <w:r>
+        <w:rPr>
+          <w:b/>
+          <w:bCs/>
+        </w:rPr>
+        <w:t xml:space="preserve">SEO improvements (from external audit)</w:t>
+      </w:r>
+      <w:r>
+        <w:t xml:space="preserve">: (1) </w:t>
+      </w:r>
+      <w:r>
+        <w:rPr>
+          <w:b/>
+          <w:bCs/>
+        </w:rPr>
+        <w:t xml:space="preserve">Image descriptions (alt text)</w:t>
+      </w:r>
+      <w:r>
+        <w:t xml:space="preserve"> — every image upload now has a description box (article cover, images inserted into articles, destination image, event image, homepage banner); these are added to the live pages for Google Images and screen readers, defaulting to the item's name if left blank. (2) </w:t>
+      </w:r>
+      <w:r>
+        <w:rPr>
+          <w:b/>
+          <w:bCs/>
+        </w:rPr>
+        <w:t xml:space="preserve">Editable web addresses</w:t>
+      </w:r>
+      <w:r>
+        <w:t xml:space="preserve"> — Articles and Content pages now let you hand-edit the address (slug); when changed, the old address </w:t>
+      </w:r>
+      <w:r>
+        <w:rPr>
+          <w:b/>
+          <w:bCs/>
+        </w:rPr>
+        <w:t xml:space="preserve">automatically forwards (301)</w:t>
+      </w:r>
+      <w:r>
+        <w:t xml:space="preserve"> to the new one, so shared links and Google rankings don't break. Verified live. Note: three audit items (canonical tags, Google Analytics + Search Console fields, single H1 per page) were found to </w:t>
+      </w:r>
+      <w:r>
+        <w:rPr>
+          <w:b/>
+          <w:bCs/>
+        </w:rPr>
+        <w:t xml:space="preserve">already exist</w:t>
+      </w:r>
+      <w:r>
+        <w:t xml:space="preserve"> and were left unchanged.</w:t>
       </w:r>
     </w:p>
     <w:p>

</xml_diff>